<commit_message>
Remove sensitive API Key
</commit_message>
<xml_diff>
--- a/Experts/Anhnt/Document/MQL5 Note/2026 0722 Kế hoạch tách module GUIPannel.docx
+++ b/Experts/Anhnt/Document/MQL5 Note/2026 0722 Kế hoạch tách module GUIPannel.docx
@@ -2627,6 +2627,586 @@
         <w:t>, thay vì là CGUIPannel::BuildAndWriteSignalBridge().</w:t>
       </w:r>
     </w:p>
+    <w:p>
+      <w:pPr>
+        <w:pStyle w:val="Heading1"/>
+      </w:pPr>
+      <w:r>
+        <w:t>Inforwindows</w:t>
+      </w:r>
+    </w:p>
+    <w:p>
+      <w:r>
+        <w:t>Ngắn gọn — m_candle_info_shown_bar được gán từ "thời điểm mở của nến (bar_time)" mà GUI lấy bằng cách chuyển tọa độ con trỏ trên chart về thời gian, rồi đối chiếu với dãy nến. Sau đó nội dung popup được điền từ lịch sử tín hiệu của các indicator. Cụ thể:</w:t>
+      </w:r>
+    </w:p>
+    <w:p>
+      <w:pPr>
+        <w:numPr>
+          <w:ilvl w:val="0"/>
+          <w:numId w:val="15"/>
+        </w:numPr>
+      </w:pPr>
+      <w:r>
+        <w:t>Cách tính bar_time (nơi lấy giá trị để gán m_candle_info_shown_bar)</w:t>
+      </w:r>
+    </w:p>
+    <w:p>
+      <w:pPr>
+        <w:numPr>
+          <w:ilvl w:val="0"/>
+          <w:numId w:val="16"/>
+        </w:numPr>
+      </w:pPr>
+      <w:r>
+        <w:t>Trong OnEvent (GUIPannel_Lifecycle.mqh) khi nhận CHARTEVENT_MOUSE_MOVE và Ctrl đang nhấn:</w:t>
+      </w:r>
+    </w:p>
+    <w:p>
+      <w:pPr>
+        <w:numPr>
+          <w:ilvl w:val="1"/>
+          <w:numId w:val="16"/>
+        </w:numPr>
+      </w:pPr>
+      <w:r>
+        <w:t>ChartXYToTimePrice(m_chart_id, m_mouse.X(), m_mouse.Y(), sub_window, t, price) =&gt; lấy thời gian t từ toạ độ chuột.</w:t>
+      </w:r>
+    </w:p>
+    <w:p>
+      <w:pPr>
+        <w:numPr>
+          <w:ilvl w:val="1"/>
+          <w:numId w:val="16"/>
+        </w:numPr>
+      </w:pPr>
+      <w:r>
+        <w:t>shift = iBarShift(symbol, tf, t, false)</w:t>
+      </w:r>
+    </w:p>
+    <w:p>
+      <w:pPr>
+        <w:numPr>
+          <w:ilvl w:val="1"/>
+          <w:numId w:val="16"/>
+        </w:numPr>
+      </w:pPr>
+      <w:r>
+        <w:t>bar_time = iTime(symbol, tf, shift)</w:t>
+      </w:r>
+    </w:p>
+    <w:p>
+      <w:pPr>
+        <w:numPr>
+          <w:ilvl w:val="1"/>
+          <w:numId w:val="16"/>
+        </w:numPr>
+      </w:pPr>
+      <w:r>
+        <w:lastRenderedPageBreak/>
+        <w:t>nếu bar_time khác m_candle_info_shown_bar thì gọi RefreshCandleInfoWindow(bar_time)</w:t>
+      </w:r>
+    </w:p>
+    <w:p>
+      <w:pPr>
+        <w:numPr>
+          <w:ilvl w:val="1"/>
+          <w:numId w:val="16"/>
+        </w:numPr>
+      </w:pPr>
+      <w:r>
+        <w:t>nếu RefreshCandleInfoWindow trả true thì:</w:t>
+      </w:r>
+      <w:r>
+        <w:br/>
+        <w:t>m_candle_info_shown_bar = bar_time;</w:t>
+      </w:r>
+      <w:r>
+        <w:br/>
+        <w:t>ShowCandleInfoPopup(...);</w:t>
+      </w:r>
+    </w:p>
+    <w:p>
+      <w:pPr>
+        <w:numPr>
+          <w:ilvl w:val="1"/>
+          <w:numId w:val="16"/>
+        </w:numPr>
+      </w:pPr>
+      <w:r>
+        <w:t>nếu không có signal thì set m_candle_info_shown_bar = 0 (ẩn popup).</w:t>
+      </w:r>
+    </w:p>
+    <w:p>
+      <w:r>
+        <w:t>(Tham khảo: GUIPannel_Lifecycle.mqh — đoạn xử lý CHARTEVENT_MOUSE_MOVE, dòng tạo bar_time và gán m_candle_info_shown_bar.)</w:t>
+      </w:r>
+    </w:p>
+    <w:p>
+      <w:pPr>
+        <w:numPr>
+          <w:ilvl w:val="0"/>
+          <w:numId w:val="17"/>
+        </w:numPr>
+      </w:pPr>
+      <w:r>
+        <w:t>Nguồn dữ liệu dùng để "fill" nội dung popup</w:t>
+      </w:r>
+    </w:p>
+    <w:p>
+      <w:pPr>
+        <w:numPr>
+          <w:ilvl w:val="0"/>
+          <w:numId w:val="18"/>
+        </w:numPr>
+      </w:pPr>
+      <w:r>
+        <w:rPr>
+          <w:highlight w:val="green"/>
+        </w:rPr>
+        <w:t>RefreshCandleInfoWindow</w:t>
+      </w:r>
+      <w:r>
+        <w:t>(bar_time) (GUIPannel_CandleInfoWindow.mqh) chịu trách nhiệm populate m_table_candle_information_atBar.</w:t>
+      </w:r>
+    </w:p>
+    <w:p>
+      <w:pPr>
+        <w:numPr>
+          <w:ilvl w:val="0"/>
+          <w:numId w:val="18"/>
+        </w:numPr>
+      </w:pPr>
+      <w:r>
+        <w:t>Nó lấy:</w:t>
+      </w:r>
+    </w:p>
+    <w:p>
+      <w:pPr>
+        <w:numPr>
+          <w:ilvl w:val="1"/>
+          <w:numId w:val="18"/>
+        </w:numPr>
+      </w:pPr>
+      <w:r>
+        <w:t>danh sách time series cho symbol hiện tại: m_BarTimeSeriesCollection.GetTimeseries(sym)</w:t>
+      </w:r>
+    </w:p>
+    <w:p>
+      <w:pPr>
+        <w:numPr>
+          <w:ilvl w:val="1"/>
+          <w:numId w:val="18"/>
+        </w:numPr>
+      </w:pPr>
+      <w:r>
+        <w:t>danh sách indicator liên quan: m_IndicatorsCollection.GetListIndBySymbol(sym), lọc theo timeframe</w:t>
+      </w:r>
+    </w:p>
+    <w:p>
+      <w:pPr>
+        <w:numPr>
+          <w:ilvl w:val="1"/>
+          <w:numId w:val="18"/>
+        </w:numPr>
+      </w:pPr>
+      <w:r>
+        <w:t>cho mỗi indicator: lấy đối tượng signal qua m_time_series_engine.GetSignalsCollection().GetOrCreateSignal(ind)</w:t>
+      </w:r>
+    </w:p>
+    <w:p>
+      <w:pPr>
+        <w:numPr>
+          <w:ilvl w:val="1"/>
+          <w:numId w:val="18"/>
+        </w:numPr>
+      </w:pPr>
+      <w:r>
+        <w:t>duyệt lịch sử signal (signal.HistoryTime(h), signal.HistoryDir(h)) để thu mọi flip có thời gian ht nằm trong [bar_time, bar_time + PeriodSeconds())</w:t>
+      </w:r>
+    </w:p>
+    <w:p>
+      <w:pPr>
+        <w:numPr>
+          <w:ilvl w:val="1"/>
+          <w:numId w:val="18"/>
+        </w:numPr>
+      </w:pPr>
+      <w:r>
+        <w:t>(với IND_BANDS còn thêm line-history upper/lower)</w:t>
+      </w:r>
+    </w:p>
+    <w:p>
+      <w:pPr>
+        <w:numPr>
+          <w:ilvl w:val="0"/>
+          <w:numId w:val="18"/>
+        </w:numPr>
+      </w:pPr>
+      <w:r>
+        <w:t>Nếu có ít nhất 1 flip trong khoảng này thì RefreshCandleInfoWindow trả true (và table được điền), ngược lại trả false.</w:t>
+      </w:r>
+    </w:p>
+    <w:p>
+      <w:r>
+        <w:t>(Tham khảo: GUIPannel_CandleInfoWindow.mqh — hàm RefreshCandleInfoWindow, đoạn lấy series, indicator, signal và đọc HistoryTime/HistoryDir.)</w:t>
+      </w:r>
+    </w:p>
+    <w:p>
+      <w:pPr>
+        <w:numPr>
+          <w:ilvl w:val="0"/>
+          <w:numId w:val="19"/>
+        </w:numPr>
+      </w:pPr>
+      <w:r>
+        <w:t>Kết luận &amp; cách thao tác nếu muốn tự điền/muốn lấy dữ liệu</w:t>
+      </w:r>
+    </w:p>
+    <w:p>
+      <w:pPr>
+        <w:numPr>
+          <w:ilvl w:val="0"/>
+          <w:numId w:val="20"/>
+        </w:numPr>
+      </w:pPr>
+      <w:r>
+        <w:t>Để gán m_candle_info_shown_bar: cần giá trị bar_time như trên (ChartXYToTimePrice -&gt; iBarShift -&gt; iTime). Gán trực tiếp m_candle_info_shown_bar = bar_time sau khi RefreshCandleInfoWindow(bar_time) trả true.</w:t>
+      </w:r>
+    </w:p>
+    <w:p>
+      <w:pPr>
+        <w:numPr>
+          <w:ilvl w:val="0"/>
+          <w:numId w:val="20"/>
+        </w:numPr>
+      </w:pPr>
+      <w:r>
+        <w:lastRenderedPageBreak/>
+        <w:t>Để lấy dữ liệu chi tiết của popup: dùng RefreshCandleInfoWindow(bar_time) — nó sẽ dùng m_time_series_engine / m_IndicatorsCollection / m_BarTimeSeriesCollection để đọc history của mỗi signal.</w:t>
+      </w:r>
+    </w:p>
+    <w:p>
+      <w:pPr>
+        <w:numPr>
+          <w:ilvl w:val="0"/>
+          <w:numId w:val="20"/>
+        </w:numPr>
+      </w:pPr>
+      <w:r>
+        <w:t>Để ẩn popup: gán m_candle_info_shown_bar = 0 và gọi HideCandleInfoPopup().</w:t>
+      </w:r>
+    </w:p>
+    <w:p>
+      <w:pPr>
+        <w:pStyle w:val="Heading1"/>
+      </w:pPr>
+      <w:r>
+        <w:t>Sound alert</w:t>
+      </w:r>
+    </w:p>
+    <w:p>
+      <w:r>
+        <w:t>Việc phát âm thanh (Sound Alert) khi có tín hiệu mới được thực hiện trong method </w:t>
+      </w:r>
+      <w:r>
+        <w:rPr>
+          <w:b/>
+          <w:bCs/>
+        </w:rPr>
+        <w:t>CheckIndicatorAlerts()</w:t>
+      </w:r>
+      <w:r>
+        <w:t> nằm ở file </w:t>
+      </w:r>
+    </w:p>
+    <w:p>
+      <w:r>
+        <mc:AlternateContent>
+          <mc:Choice Requires="wps">
+            <w:drawing>
+              <wp:inline distT="0" distB="0" distL="0" distR="0" wp14:anchorId="18D3E62E" wp14:editId="01740D8C">
+                <wp:extent cx="304800" cy="304800"/>
+                <wp:effectExtent l="0" t="0" r="0" b="0"/>
+                <wp:docPr id="1909832565" name="Rectangle 2"/>
+                <wp:cNvGraphicFramePr>
+                  <a:graphicFrameLocks xmlns:a="http://schemas.openxmlformats.org/drawingml/2006/main" noChangeAspect="1"/>
+                </wp:cNvGraphicFramePr>
+                <a:graphic xmlns:a="http://schemas.openxmlformats.org/drawingml/2006/main">
+                  <a:graphicData uri="http://schemas.microsoft.com/office/word/2010/wordprocessingShape">
+                    <wps:wsp>
+                      <wps:cNvSpPr>
+                        <a:spLocks noChangeAspect="1" noChangeArrowheads="1"/>
+                      </wps:cNvSpPr>
+                      <wps:spPr bwMode="auto">
+                        <a:xfrm>
+                          <a:off x="0" y="0"/>
+                          <a:ext cx="304800" cy="304800"/>
+                        </a:xfrm>
+                        <a:prstGeom prst="rect">
+                          <a:avLst/>
+                        </a:prstGeom>
+                        <a:noFill/>
+                        <a:ln>
+                          <a:noFill/>
+                        </a:ln>
+                        <a:extLst>
+                          <a:ext uri="{909E8E84-426E-40DD-AFC4-6F175D3DCCD1}">
+                            <a14:hiddenFill xmlns:a14="http://schemas.microsoft.com/office/drawing/2010/main">
+                              <a:solidFill>
+                                <a:srgbClr val="FFFFFF"/>
+                              </a:solidFill>
+                            </a14:hiddenFill>
+                          </a:ext>
+                          <a:ext uri="{91240B29-F687-4F45-9708-019B960494DF}">
+                            <a14:hiddenLine xmlns:a14="http://schemas.microsoft.com/office/drawing/2010/main" w="9525">
+                              <a:solidFill>
+                                <a:srgbClr val="000000"/>
+                              </a:solidFill>
+                              <a:miter lim="800000"/>
+                              <a:headEnd/>
+                              <a:tailEnd/>
+                            </a14:hiddenLine>
+                          </a:ext>
+                        </a:extLst>
+                      </wps:spPr>
+                      <wps:bodyPr rot="0" vert="horz" wrap="square" lIns="91440" tIns="45720" rIns="91440" bIns="45720" anchor="t" anchorCtr="0" upright="1">
+                        <a:noAutofit/>
+                      </wps:bodyPr>
+                    </wps:wsp>
+                  </a:graphicData>
+                </a:graphic>
+              </wp:inline>
+            </w:drawing>
+          </mc:Choice>
+          <mc:Fallback>
+            <w:pict>
+              <v:rect w14:anchorId="30A5A89B" id="Rectangle 2" o:spid="_x0000_s1026" style="width:24pt;height:24pt;visibility:visible;mso-wrap-style:square;mso-left-percent:-10001;mso-top-percent:-10001;mso-position-horizontal:absolute;mso-position-horizontal-relative:char;mso-position-vertical:absolute;mso-position-vertical-relative:line;mso-left-percent:-10001;mso-top-percent:-10001;v-text-anchor:top" o:gfxdata="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" filled="f" stroked="f">
+                <o:lock v:ext="edit" aspectratio="t"/>
+                <w10:anchorlock/>
+              </v:rect>
+            </w:pict>
+          </mc:Fallback>
+        </mc:AlternateContent>
+      </w:r>
+    </w:p>
+    <w:p>
+      <w:r>
+        <w:t>GUIPannel_Lifecycle.mqh.</w:t>
+      </w:r>
+    </w:p>
+    <w:p>
+      <w:r>
+        <w:t>Cụ thể đoạn code xử lý như sau:</w:t>
+      </w:r>
+    </w:p>
+    <w:p>
+      <w:r>
+        <w:t>cpp</w:t>
+      </w:r>
+    </w:p>
+    <w:p>
+      <w:r>
+        <w:t>if(sound_on)</w:t>
+      </w:r>
+    </w:p>
+    <w:p>
+      <w:r>
+        <w:t xml:space="preserve">  {</w:t>
+      </w:r>
+    </w:p>
+    <w:p>
+      <w:r>
+        <w:t xml:space="preserve">   // --- Deliberately native ::PlaySound()</w:t>
+      </w:r>
+    </w:p>
+    <w:p>
+      <w:r>
+        <w:t xml:space="preserve">   string file = is_buy ? m_marker_buy_sound_file : m_marker_sell_sound_file;</w:t>
+      </w:r>
+    </w:p>
+    <w:p>
+      <w:r>
+        <w:t xml:space="preserve">   if(file != "")</w:t>
+      </w:r>
+    </w:p>
+    <w:p>
+      <w:r>
+        <w:t xml:space="preserve">      ::PlaySound(file);</w:t>
+      </w:r>
+    </w:p>
+    <w:p>
+      <w:r>
+        <w:t xml:space="preserve">  }</w:t>
+      </w:r>
+    </w:p>
+    <w:p>
+      <w:r>
+        <w:t>Luồng hoạt động của âm thanh:</w:t>
+      </w:r>
+    </w:p>
+    <w:p>
+      <w:pPr>
+        <w:numPr>
+          <w:ilvl w:val="0"/>
+          <w:numId w:val="21"/>
+        </w:numPr>
+      </w:pPr>
+      <w:r>
+        <w:rPr>
+          <w:b/>
+          <w:bCs/>
+        </w:rPr>
+        <w:t>Trigger</w:t>
+      </w:r>
+      <w:r>
+        <w:t>: Hàm CheckIndicatorAlerts() được gọi liên tục mỗi khi có timer tick trong OnTimerEvent().</w:t>
+      </w:r>
+    </w:p>
+    <w:p>
+      <w:pPr>
+        <w:numPr>
+          <w:ilvl w:val="0"/>
+          <w:numId w:val="21"/>
+        </w:numPr>
+      </w:pPr>
+      <w:r>
+        <w:rPr>
+          <w:b/>
+          <w:bCs/>
+        </w:rPr>
+        <w:t>Điều kiện</w:t>
+      </w:r>
+      <w:r>
+        <w:t>:</w:t>
+      </w:r>
+    </w:p>
+    <w:p>
+      <w:pPr>
+        <w:numPr>
+          <w:ilvl w:val="1"/>
+          <w:numId w:val="21"/>
+        </w:numPr>
+      </w:pPr>
+      <w:r>
+        <w:t>Cột </w:t>
+      </w:r>
+      <w:r>
+        <w:rPr>
+          <w:b/>
+          <w:bCs/>
+        </w:rPr>
+        <w:t>Sound</w:t>
+      </w:r>
+      <w:r>
+        <w:t> (checkbox ở cột index 5) của indicator đó trên bảng m_table_indicator được tick chọn (sound_on == true).</w:t>
+      </w:r>
+    </w:p>
+    <w:p>
+      <w:pPr>
+        <w:numPr>
+          <w:ilvl w:val="1"/>
+          <w:numId w:val="21"/>
+        </w:numPr>
+      </w:pPr>
+      <w:r>
+        <w:t>Có một tín hiệu mới hình thành ở cây nến hiện tại (Live bar 0) lật sang hướng khác với lần kiểm tra trước (live_dir != m_live_signal_last_seen[row]).</w:t>
+      </w:r>
+    </w:p>
+    <w:p>
+      <w:pPr>
+        <w:numPr>
+          <w:ilvl w:val="0"/>
+          <w:numId w:val="21"/>
+        </w:numPr>
+      </w:pPr>
+      <w:r>
+        <w:rPr>
+          <w:b/>
+          <w:bCs/>
+        </w:rPr>
+        <w:t>Phát âm thanh</w:t>
+      </w:r>
+      <w:r>
+        <w:t>:</w:t>
+      </w:r>
+    </w:p>
+    <w:p>
+      <w:pPr>
+        <w:numPr>
+          <w:ilvl w:val="1"/>
+          <w:numId w:val="21"/>
+        </w:numPr>
+      </w:pPr>
+      <w:r>
+        <w:lastRenderedPageBreak/>
+        <w:t>Tùy vào hướng tín hiệu (Buy hay Sell), nó sẽ lấy tên file âm thanh tương ứng (m_marker_buy_sound_file hoặc m_marker_sell_sound_file) đã chọn ở tab </w:t>
+      </w:r>
+      <w:r>
+        <w:rPr>
+          <w:b/>
+          <w:bCs/>
+        </w:rPr>
+        <w:t>Settings -&gt; Marker</w:t>
+      </w:r>
+      <w:r>
+        <w:t>.</w:t>
+      </w:r>
+    </w:p>
+    <w:p>
+      <w:pPr>
+        <w:numPr>
+          <w:ilvl w:val="1"/>
+          <w:numId w:val="21"/>
+        </w:numPr>
+      </w:pPr>
+      <w:r>
+        <w:t>Gọi hàm native MQL5 </w:t>
+      </w:r>
+      <w:r>
+        <w:rPr>
+          <w:b/>
+          <w:bCs/>
+        </w:rPr>
+        <w:t>::PlaySound(file)</w:t>
+      </w:r>
+      <w:r>
+        <w:t> để phát file .wav (file này nằm trong thư mục MQL5\Sounds\).</w:t>
+      </w:r>
+    </w:p>
+    <w:p>
+      <w:pPr>
+        <w:pStyle w:val="Heading1"/>
+      </w:pPr>
+      <w:r>
+        <w:t>Save Config</w:t>
+      </w:r>
+    </w:p>
+    <w:p>
+      <w:r>
+        <w:t>void CGUIPannel::SaveMarkerSettings(void)</w:t>
+      </w:r>
+    </w:p>
+    <w:p>
+      <w:r>
+        <w:t>{</w:t>
+      </w:r>
+    </w:p>
+    <w:p>
+      <w:r>
+        <w:t>// ... Thu thập các giá trị shape code, color, sound folder, sound files ...</w:t>
+      </w:r>
+    </w:p>
+    <w:p>
+      <w:r>
+        <w:t>// ... Tự ghi trực tiếp chuỗi JSON section "markers" vào "Config_Setting.json" ...</w:t>
+      </w:r>
+    </w:p>
+    <w:p>
+      <w:r>
+        <w:t>}</w:t>
+      </w:r>
+    </w:p>
     <w:p/>
     <w:sectPr>
       <w:pgSz w:w="12240" w:h="15840"/>
@@ -3088,6 +3668,119 @@
     </w:lvl>
   </w:abstractNum>
   <w:abstractNum w:abstractNumId="3" w15:restartNumberingAfterBreak="0">
+    <w:nsid w:val="271D3619"/>
+    <w:multiLevelType w:val="multilevel"/>
+    <w:tmpl w:val="488A617C"/>
+    <w:lvl w:ilvl="0">
+      <w:start w:val="3"/>
+      <w:numFmt w:val="decimal"/>
+      <w:lvlText w:val="%1."/>
+      <w:lvlJc w:val="left"/>
+      <w:pPr>
+        <w:tabs>
+          <w:tab w:val="num" w:pos="720"/>
+        </w:tabs>
+        <w:ind w:left="720" w:hanging="360"/>
+      </w:pPr>
+    </w:lvl>
+    <w:lvl w:ilvl="1" w:tentative="1">
+      <w:start w:val="1"/>
+      <w:numFmt w:val="decimal"/>
+      <w:lvlText w:val="%2."/>
+      <w:lvlJc w:val="left"/>
+      <w:pPr>
+        <w:tabs>
+          <w:tab w:val="num" w:pos="1440"/>
+        </w:tabs>
+        <w:ind w:left="1440" w:hanging="360"/>
+      </w:pPr>
+    </w:lvl>
+    <w:lvl w:ilvl="2" w:tentative="1">
+      <w:start w:val="1"/>
+      <w:numFmt w:val="decimal"/>
+      <w:lvlText w:val="%3."/>
+      <w:lvlJc w:val="left"/>
+      <w:pPr>
+        <w:tabs>
+          <w:tab w:val="num" w:pos="2160"/>
+        </w:tabs>
+        <w:ind w:left="2160" w:hanging="360"/>
+      </w:pPr>
+    </w:lvl>
+    <w:lvl w:ilvl="3" w:tentative="1">
+      <w:start w:val="1"/>
+      <w:numFmt w:val="decimal"/>
+      <w:lvlText w:val="%4."/>
+      <w:lvlJc w:val="left"/>
+      <w:pPr>
+        <w:tabs>
+          <w:tab w:val="num" w:pos="2880"/>
+        </w:tabs>
+        <w:ind w:left="2880" w:hanging="360"/>
+      </w:pPr>
+    </w:lvl>
+    <w:lvl w:ilvl="4" w:tentative="1">
+      <w:start w:val="1"/>
+      <w:numFmt w:val="decimal"/>
+      <w:lvlText w:val="%5."/>
+      <w:lvlJc w:val="left"/>
+      <w:pPr>
+        <w:tabs>
+          <w:tab w:val="num" w:pos="3600"/>
+        </w:tabs>
+        <w:ind w:left="3600" w:hanging="360"/>
+      </w:pPr>
+    </w:lvl>
+    <w:lvl w:ilvl="5" w:tentative="1">
+      <w:start w:val="1"/>
+      <w:numFmt w:val="decimal"/>
+      <w:lvlText w:val="%6."/>
+      <w:lvlJc w:val="left"/>
+      <w:pPr>
+        <w:tabs>
+          <w:tab w:val="num" w:pos="4320"/>
+        </w:tabs>
+        <w:ind w:left="4320" w:hanging="360"/>
+      </w:pPr>
+    </w:lvl>
+    <w:lvl w:ilvl="6" w:tentative="1">
+      <w:start w:val="1"/>
+      <w:numFmt w:val="decimal"/>
+      <w:lvlText w:val="%7."/>
+      <w:lvlJc w:val="left"/>
+      <w:pPr>
+        <w:tabs>
+          <w:tab w:val="num" w:pos="5040"/>
+        </w:tabs>
+        <w:ind w:left="5040" w:hanging="360"/>
+      </w:pPr>
+    </w:lvl>
+    <w:lvl w:ilvl="7" w:tentative="1">
+      <w:start w:val="1"/>
+      <w:numFmt w:val="decimal"/>
+      <w:lvlText w:val="%8."/>
+      <w:lvlJc w:val="left"/>
+      <w:pPr>
+        <w:tabs>
+          <w:tab w:val="num" w:pos="5760"/>
+        </w:tabs>
+        <w:ind w:left="5760" w:hanging="360"/>
+      </w:pPr>
+    </w:lvl>
+    <w:lvl w:ilvl="8" w:tentative="1">
+      <w:start w:val="1"/>
+      <w:numFmt w:val="decimal"/>
+      <w:lvlText w:val="%9."/>
+      <w:lvlJc w:val="left"/>
+      <w:pPr>
+        <w:tabs>
+          <w:tab w:val="num" w:pos="6480"/>
+        </w:tabs>
+        <w:ind w:left="6480" w:hanging="360"/>
+      </w:pPr>
+    </w:lvl>
+  </w:abstractNum>
+  <w:abstractNum w:abstractNumId="4" w15:restartNumberingAfterBreak="0">
     <w:nsid w:val="29880C75"/>
     <w:multiLevelType w:val="multilevel"/>
     <w:tmpl w:val="343C70FC"/>
@@ -3236,7 +3929,7 @@
       </w:rPr>
     </w:lvl>
   </w:abstractNum>
-  <w:abstractNum w:abstractNumId="4" w15:restartNumberingAfterBreak="0">
+  <w:abstractNum w:abstractNumId="5" w15:restartNumberingAfterBreak="0">
     <w:nsid w:val="353D2609"/>
     <w:multiLevelType w:val="multilevel"/>
     <w:tmpl w:val="B440993C"/>
@@ -3385,7 +4078,7 @@
       </w:rPr>
     </w:lvl>
   </w:abstractNum>
-  <w:abstractNum w:abstractNumId="5" w15:restartNumberingAfterBreak="0">
+  <w:abstractNum w:abstractNumId="6" w15:restartNumberingAfterBreak="0">
     <w:nsid w:val="35717565"/>
     <w:multiLevelType w:val="multilevel"/>
     <w:tmpl w:val="DB969768"/>
@@ -3534,7 +4227,7 @@
       </w:rPr>
     </w:lvl>
   </w:abstractNum>
-  <w:abstractNum w:abstractNumId="6" w15:restartNumberingAfterBreak="0">
+  <w:abstractNum w:abstractNumId="7" w15:restartNumberingAfterBreak="0">
     <w:nsid w:val="36C01CD6"/>
     <w:multiLevelType w:val="multilevel"/>
     <w:tmpl w:val="D004DC3C"/>
@@ -3683,7 +4376,156 @@
       </w:rPr>
     </w:lvl>
   </w:abstractNum>
-  <w:abstractNum w:abstractNumId="7" w15:restartNumberingAfterBreak="0">
+  <w:abstractNum w:abstractNumId="8" w15:restartNumberingAfterBreak="0">
+    <w:nsid w:val="3C530299"/>
+    <w:multiLevelType w:val="multilevel"/>
+    <w:tmpl w:val="BBB465EE"/>
+    <w:lvl w:ilvl="0">
+      <w:start w:val="1"/>
+      <w:numFmt w:val="bullet"/>
+      <w:lvlText w:val=""/>
+      <w:lvlJc w:val="left"/>
+      <w:pPr>
+        <w:tabs>
+          <w:tab w:val="num" w:pos="720"/>
+        </w:tabs>
+        <w:ind w:left="720" w:hanging="360"/>
+      </w:pPr>
+      <w:rPr>
+        <w:rFonts w:ascii="Symbol" w:hAnsi="Symbol" w:hint="default"/>
+        <w:sz w:val="20"/>
+      </w:rPr>
+    </w:lvl>
+    <w:lvl w:ilvl="1">
+      <w:start w:val="1"/>
+      <w:numFmt w:val="bullet"/>
+      <w:lvlText w:val="o"/>
+      <w:lvlJc w:val="left"/>
+      <w:pPr>
+        <w:tabs>
+          <w:tab w:val="num" w:pos="1440"/>
+        </w:tabs>
+        <w:ind w:left="1440" w:hanging="360"/>
+      </w:pPr>
+      <w:rPr>
+        <w:rFonts w:ascii="Courier New" w:hAnsi="Courier New" w:hint="default"/>
+        <w:sz w:val="20"/>
+      </w:rPr>
+    </w:lvl>
+    <w:lvl w:ilvl="2" w:tentative="1">
+      <w:start w:val="1"/>
+      <w:numFmt w:val="bullet"/>
+      <w:lvlText w:val=""/>
+      <w:lvlJc w:val="left"/>
+      <w:pPr>
+        <w:tabs>
+          <w:tab w:val="num" w:pos="2160"/>
+        </w:tabs>
+        <w:ind w:left="2160" w:hanging="360"/>
+      </w:pPr>
+      <w:rPr>
+        <w:rFonts w:ascii="Wingdings" w:hAnsi="Wingdings" w:hint="default"/>
+        <w:sz w:val="20"/>
+      </w:rPr>
+    </w:lvl>
+    <w:lvl w:ilvl="3" w:tentative="1">
+      <w:start w:val="1"/>
+      <w:numFmt w:val="bullet"/>
+      <w:lvlText w:val=""/>
+      <w:lvlJc w:val="left"/>
+      <w:pPr>
+        <w:tabs>
+          <w:tab w:val="num" w:pos="2880"/>
+        </w:tabs>
+        <w:ind w:left="2880" w:hanging="360"/>
+      </w:pPr>
+      <w:rPr>
+        <w:rFonts w:ascii="Wingdings" w:hAnsi="Wingdings" w:hint="default"/>
+        <w:sz w:val="20"/>
+      </w:rPr>
+    </w:lvl>
+    <w:lvl w:ilvl="4" w:tentative="1">
+      <w:start w:val="1"/>
+      <w:numFmt w:val="bullet"/>
+      <w:lvlText w:val=""/>
+      <w:lvlJc w:val="left"/>
+      <w:pPr>
+        <w:tabs>
+          <w:tab w:val="num" w:pos="3600"/>
+        </w:tabs>
+        <w:ind w:left="3600" w:hanging="360"/>
+      </w:pPr>
+      <w:rPr>
+        <w:rFonts w:ascii="Wingdings" w:hAnsi="Wingdings" w:hint="default"/>
+        <w:sz w:val="20"/>
+      </w:rPr>
+    </w:lvl>
+    <w:lvl w:ilvl="5" w:tentative="1">
+      <w:start w:val="1"/>
+      <w:numFmt w:val="bullet"/>
+      <w:lvlText w:val=""/>
+      <w:lvlJc w:val="left"/>
+      <w:pPr>
+        <w:tabs>
+          <w:tab w:val="num" w:pos="4320"/>
+        </w:tabs>
+        <w:ind w:left="4320" w:hanging="360"/>
+      </w:pPr>
+      <w:rPr>
+        <w:rFonts w:ascii="Wingdings" w:hAnsi="Wingdings" w:hint="default"/>
+        <w:sz w:val="20"/>
+      </w:rPr>
+    </w:lvl>
+    <w:lvl w:ilvl="6" w:tentative="1">
+      <w:start w:val="1"/>
+      <w:numFmt w:val="bullet"/>
+      <w:lvlText w:val=""/>
+      <w:lvlJc w:val="left"/>
+      <w:pPr>
+        <w:tabs>
+          <w:tab w:val="num" w:pos="5040"/>
+        </w:tabs>
+        <w:ind w:left="5040" w:hanging="360"/>
+      </w:pPr>
+      <w:rPr>
+        <w:rFonts w:ascii="Wingdings" w:hAnsi="Wingdings" w:hint="default"/>
+        <w:sz w:val="20"/>
+      </w:rPr>
+    </w:lvl>
+    <w:lvl w:ilvl="7" w:tentative="1">
+      <w:start w:val="1"/>
+      <w:numFmt w:val="bullet"/>
+      <w:lvlText w:val=""/>
+      <w:lvlJc w:val="left"/>
+      <w:pPr>
+        <w:tabs>
+          <w:tab w:val="num" w:pos="5760"/>
+        </w:tabs>
+        <w:ind w:left="5760" w:hanging="360"/>
+      </w:pPr>
+      <w:rPr>
+        <w:rFonts w:ascii="Wingdings" w:hAnsi="Wingdings" w:hint="default"/>
+        <w:sz w:val="20"/>
+      </w:rPr>
+    </w:lvl>
+    <w:lvl w:ilvl="8" w:tentative="1">
+      <w:start w:val="1"/>
+      <w:numFmt w:val="bullet"/>
+      <w:lvlText w:val=""/>
+      <w:lvlJc w:val="left"/>
+      <w:pPr>
+        <w:tabs>
+          <w:tab w:val="num" w:pos="6480"/>
+        </w:tabs>
+        <w:ind w:left="6480" w:hanging="360"/>
+      </w:pPr>
+      <w:rPr>
+        <w:rFonts w:ascii="Wingdings" w:hAnsi="Wingdings" w:hint="default"/>
+        <w:sz w:val="20"/>
+      </w:rPr>
+    </w:lvl>
+  </w:abstractNum>
+  <w:abstractNum w:abstractNumId="9" w15:restartNumberingAfterBreak="0">
     <w:nsid w:val="429937B7"/>
     <w:multiLevelType w:val="multilevel"/>
     <w:tmpl w:val="44CEE5FA"/>
@@ -3832,7 +4674,305 @@
       </w:rPr>
     </w:lvl>
   </w:abstractNum>
-  <w:abstractNum w:abstractNumId="8" w15:restartNumberingAfterBreak="0">
+  <w:abstractNum w:abstractNumId="10" w15:restartNumberingAfterBreak="0">
+    <w:nsid w:val="4B0B3330"/>
+    <w:multiLevelType w:val="multilevel"/>
+    <w:tmpl w:val="F62C8084"/>
+    <w:lvl w:ilvl="0">
+      <w:start w:val="1"/>
+      <w:numFmt w:val="bullet"/>
+      <w:lvlText w:val=""/>
+      <w:lvlJc w:val="left"/>
+      <w:pPr>
+        <w:tabs>
+          <w:tab w:val="num" w:pos="720"/>
+        </w:tabs>
+        <w:ind w:left="720" w:hanging="360"/>
+      </w:pPr>
+      <w:rPr>
+        <w:rFonts w:ascii="Symbol" w:hAnsi="Symbol" w:hint="default"/>
+        <w:sz w:val="20"/>
+      </w:rPr>
+    </w:lvl>
+    <w:lvl w:ilvl="1">
+      <w:start w:val="1"/>
+      <w:numFmt w:val="bullet"/>
+      <w:lvlText w:val="o"/>
+      <w:lvlJc w:val="left"/>
+      <w:pPr>
+        <w:tabs>
+          <w:tab w:val="num" w:pos="1440"/>
+        </w:tabs>
+        <w:ind w:left="1440" w:hanging="360"/>
+      </w:pPr>
+      <w:rPr>
+        <w:rFonts w:ascii="Courier New" w:hAnsi="Courier New" w:hint="default"/>
+        <w:sz w:val="20"/>
+      </w:rPr>
+    </w:lvl>
+    <w:lvl w:ilvl="2" w:tentative="1">
+      <w:start w:val="1"/>
+      <w:numFmt w:val="bullet"/>
+      <w:lvlText w:val=""/>
+      <w:lvlJc w:val="left"/>
+      <w:pPr>
+        <w:tabs>
+          <w:tab w:val="num" w:pos="2160"/>
+        </w:tabs>
+        <w:ind w:left="2160" w:hanging="360"/>
+      </w:pPr>
+      <w:rPr>
+        <w:rFonts w:ascii="Wingdings" w:hAnsi="Wingdings" w:hint="default"/>
+        <w:sz w:val="20"/>
+      </w:rPr>
+    </w:lvl>
+    <w:lvl w:ilvl="3" w:tentative="1">
+      <w:start w:val="1"/>
+      <w:numFmt w:val="bullet"/>
+      <w:lvlText w:val=""/>
+      <w:lvlJc w:val="left"/>
+      <w:pPr>
+        <w:tabs>
+          <w:tab w:val="num" w:pos="2880"/>
+        </w:tabs>
+        <w:ind w:left="2880" w:hanging="360"/>
+      </w:pPr>
+      <w:rPr>
+        <w:rFonts w:ascii="Wingdings" w:hAnsi="Wingdings" w:hint="default"/>
+        <w:sz w:val="20"/>
+      </w:rPr>
+    </w:lvl>
+    <w:lvl w:ilvl="4" w:tentative="1">
+      <w:start w:val="1"/>
+      <w:numFmt w:val="bullet"/>
+      <w:lvlText w:val=""/>
+      <w:lvlJc w:val="left"/>
+      <w:pPr>
+        <w:tabs>
+          <w:tab w:val="num" w:pos="3600"/>
+        </w:tabs>
+        <w:ind w:left="3600" w:hanging="360"/>
+      </w:pPr>
+      <w:rPr>
+        <w:rFonts w:ascii="Wingdings" w:hAnsi="Wingdings" w:hint="default"/>
+        <w:sz w:val="20"/>
+      </w:rPr>
+    </w:lvl>
+    <w:lvl w:ilvl="5" w:tentative="1">
+      <w:start w:val="1"/>
+      <w:numFmt w:val="bullet"/>
+      <w:lvlText w:val=""/>
+      <w:lvlJc w:val="left"/>
+      <w:pPr>
+        <w:tabs>
+          <w:tab w:val="num" w:pos="4320"/>
+        </w:tabs>
+        <w:ind w:left="4320" w:hanging="360"/>
+      </w:pPr>
+      <w:rPr>
+        <w:rFonts w:ascii="Wingdings" w:hAnsi="Wingdings" w:hint="default"/>
+        <w:sz w:val="20"/>
+      </w:rPr>
+    </w:lvl>
+    <w:lvl w:ilvl="6" w:tentative="1">
+      <w:start w:val="1"/>
+      <w:numFmt w:val="bullet"/>
+      <w:lvlText w:val=""/>
+      <w:lvlJc w:val="left"/>
+      <w:pPr>
+        <w:tabs>
+          <w:tab w:val="num" w:pos="5040"/>
+        </w:tabs>
+        <w:ind w:left="5040" w:hanging="360"/>
+      </w:pPr>
+      <w:rPr>
+        <w:rFonts w:ascii="Wingdings" w:hAnsi="Wingdings" w:hint="default"/>
+        <w:sz w:val="20"/>
+      </w:rPr>
+    </w:lvl>
+    <w:lvl w:ilvl="7" w:tentative="1">
+      <w:start w:val="1"/>
+      <w:numFmt w:val="bullet"/>
+      <w:lvlText w:val=""/>
+      <w:lvlJc w:val="left"/>
+      <w:pPr>
+        <w:tabs>
+          <w:tab w:val="num" w:pos="5760"/>
+        </w:tabs>
+        <w:ind w:left="5760" w:hanging="360"/>
+      </w:pPr>
+      <w:rPr>
+        <w:rFonts w:ascii="Wingdings" w:hAnsi="Wingdings" w:hint="default"/>
+        <w:sz w:val="20"/>
+      </w:rPr>
+    </w:lvl>
+    <w:lvl w:ilvl="8" w:tentative="1">
+      <w:start w:val="1"/>
+      <w:numFmt w:val="bullet"/>
+      <w:lvlText w:val=""/>
+      <w:lvlJc w:val="left"/>
+      <w:pPr>
+        <w:tabs>
+          <w:tab w:val="num" w:pos="6480"/>
+        </w:tabs>
+        <w:ind w:left="6480" w:hanging="360"/>
+      </w:pPr>
+      <w:rPr>
+        <w:rFonts w:ascii="Wingdings" w:hAnsi="Wingdings" w:hint="default"/>
+        <w:sz w:val="20"/>
+      </w:rPr>
+    </w:lvl>
+  </w:abstractNum>
+  <w:abstractNum w:abstractNumId="11" w15:restartNumberingAfterBreak="0">
+    <w:nsid w:val="4C7A2F17"/>
+    <w:multiLevelType w:val="multilevel"/>
+    <w:tmpl w:val="790E97B6"/>
+    <w:lvl w:ilvl="0">
+      <w:start w:val="1"/>
+      <w:numFmt w:val="bullet"/>
+      <w:lvlText w:val=""/>
+      <w:lvlJc w:val="left"/>
+      <w:pPr>
+        <w:tabs>
+          <w:tab w:val="num" w:pos="720"/>
+        </w:tabs>
+        <w:ind w:left="720" w:hanging="360"/>
+      </w:pPr>
+      <w:rPr>
+        <w:rFonts w:ascii="Symbol" w:hAnsi="Symbol" w:hint="default"/>
+        <w:sz w:val="20"/>
+      </w:rPr>
+    </w:lvl>
+    <w:lvl w:ilvl="1" w:tentative="1">
+      <w:start w:val="1"/>
+      <w:numFmt w:val="bullet"/>
+      <w:lvlText w:val="o"/>
+      <w:lvlJc w:val="left"/>
+      <w:pPr>
+        <w:tabs>
+          <w:tab w:val="num" w:pos="1440"/>
+        </w:tabs>
+        <w:ind w:left="1440" w:hanging="360"/>
+      </w:pPr>
+      <w:rPr>
+        <w:rFonts w:ascii="Courier New" w:hAnsi="Courier New" w:hint="default"/>
+        <w:sz w:val="20"/>
+      </w:rPr>
+    </w:lvl>
+    <w:lvl w:ilvl="2" w:tentative="1">
+      <w:start w:val="1"/>
+      <w:numFmt w:val="bullet"/>
+      <w:lvlText w:val=""/>
+      <w:lvlJc w:val="left"/>
+      <w:pPr>
+        <w:tabs>
+          <w:tab w:val="num" w:pos="2160"/>
+        </w:tabs>
+        <w:ind w:left="2160" w:hanging="360"/>
+      </w:pPr>
+      <w:rPr>
+        <w:rFonts w:ascii="Wingdings" w:hAnsi="Wingdings" w:hint="default"/>
+        <w:sz w:val="20"/>
+      </w:rPr>
+    </w:lvl>
+    <w:lvl w:ilvl="3" w:tentative="1">
+      <w:start w:val="1"/>
+      <w:numFmt w:val="bullet"/>
+      <w:lvlText w:val=""/>
+      <w:lvlJc w:val="left"/>
+      <w:pPr>
+        <w:tabs>
+          <w:tab w:val="num" w:pos="2880"/>
+        </w:tabs>
+        <w:ind w:left="2880" w:hanging="360"/>
+      </w:pPr>
+      <w:rPr>
+        <w:rFonts w:ascii="Wingdings" w:hAnsi="Wingdings" w:hint="default"/>
+        <w:sz w:val="20"/>
+      </w:rPr>
+    </w:lvl>
+    <w:lvl w:ilvl="4" w:tentative="1">
+      <w:start w:val="1"/>
+      <w:numFmt w:val="bullet"/>
+      <w:lvlText w:val=""/>
+      <w:lvlJc w:val="left"/>
+      <w:pPr>
+        <w:tabs>
+          <w:tab w:val="num" w:pos="3600"/>
+        </w:tabs>
+        <w:ind w:left="3600" w:hanging="360"/>
+      </w:pPr>
+      <w:rPr>
+        <w:rFonts w:ascii="Wingdings" w:hAnsi="Wingdings" w:hint="default"/>
+        <w:sz w:val="20"/>
+      </w:rPr>
+    </w:lvl>
+    <w:lvl w:ilvl="5" w:tentative="1">
+      <w:start w:val="1"/>
+      <w:numFmt w:val="bullet"/>
+      <w:lvlText w:val=""/>
+      <w:lvlJc w:val="left"/>
+      <w:pPr>
+        <w:tabs>
+          <w:tab w:val="num" w:pos="4320"/>
+        </w:tabs>
+        <w:ind w:left="4320" w:hanging="360"/>
+      </w:pPr>
+      <w:rPr>
+        <w:rFonts w:ascii="Wingdings" w:hAnsi="Wingdings" w:hint="default"/>
+        <w:sz w:val="20"/>
+      </w:rPr>
+    </w:lvl>
+    <w:lvl w:ilvl="6" w:tentative="1">
+      <w:start w:val="1"/>
+      <w:numFmt w:val="bullet"/>
+      <w:lvlText w:val=""/>
+      <w:lvlJc w:val="left"/>
+      <w:pPr>
+        <w:tabs>
+          <w:tab w:val="num" w:pos="5040"/>
+        </w:tabs>
+        <w:ind w:left="5040" w:hanging="360"/>
+      </w:pPr>
+      <w:rPr>
+        <w:rFonts w:ascii="Wingdings" w:hAnsi="Wingdings" w:hint="default"/>
+        <w:sz w:val="20"/>
+      </w:rPr>
+    </w:lvl>
+    <w:lvl w:ilvl="7" w:tentative="1">
+      <w:start w:val="1"/>
+      <w:numFmt w:val="bullet"/>
+      <w:lvlText w:val=""/>
+      <w:lvlJc w:val="left"/>
+      <w:pPr>
+        <w:tabs>
+          <w:tab w:val="num" w:pos="5760"/>
+        </w:tabs>
+        <w:ind w:left="5760" w:hanging="360"/>
+      </w:pPr>
+      <w:rPr>
+        <w:rFonts w:ascii="Wingdings" w:hAnsi="Wingdings" w:hint="default"/>
+        <w:sz w:val="20"/>
+      </w:rPr>
+    </w:lvl>
+    <w:lvl w:ilvl="8" w:tentative="1">
+      <w:start w:val="1"/>
+      <w:numFmt w:val="bullet"/>
+      <w:lvlText w:val=""/>
+      <w:lvlJc w:val="left"/>
+      <w:pPr>
+        <w:tabs>
+          <w:tab w:val="num" w:pos="6480"/>
+        </w:tabs>
+        <w:ind w:left="6480" w:hanging="360"/>
+      </w:pPr>
+      <w:rPr>
+        <w:rFonts w:ascii="Wingdings" w:hAnsi="Wingdings" w:hint="default"/>
+        <w:sz w:val="20"/>
+      </w:rPr>
+    </w:lvl>
+  </w:abstractNum>
+  <w:abstractNum w:abstractNumId="12" w15:restartNumberingAfterBreak="0">
     <w:nsid w:val="4D340721"/>
     <w:multiLevelType w:val="multilevel"/>
     <w:tmpl w:val="5FD85A94"/>
@@ -3981,7 +5121,7 @@
       </w:rPr>
     </w:lvl>
   </w:abstractNum>
-  <w:abstractNum w:abstractNumId="9" w15:restartNumberingAfterBreak="0">
+  <w:abstractNum w:abstractNumId="13" w15:restartNumberingAfterBreak="0">
     <w:nsid w:val="4E402832"/>
     <w:multiLevelType w:val="multilevel"/>
     <w:tmpl w:val="6F5A6D66"/>
@@ -4130,7 +5270,124 @@
       </w:rPr>
     </w:lvl>
   </w:abstractNum>
-  <w:abstractNum w:abstractNumId="10" w15:restartNumberingAfterBreak="0">
+  <w:abstractNum w:abstractNumId="14" w15:restartNumberingAfterBreak="0">
+    <w:nsid w:val="4ED03780"/>
+    <w:multiLevelType w:val="multilevel"/>
+    <w:tmpl w:val="F18C39AA"/>
+    <w:lvl w:ilvl="0">
+      <w:start w:val="1"/>
+      <w:numFmt w:val="decimal"/>
+      <w:lvlText w:val="%1."/>
+      <w:lvlJc w:val="left"/>
+      <w:pPr>
+        <w:tabs>
+          <w:tab w:val="num" w:pos="720"/>
+        </w:tabs>
+        <w:ind w:left="720" w:hanging="360"/>
+      </w:pPr>
+    </w:lvl>
+    <w:lvl w:ilvl="1">
+      <w:start w:val="1"/>
+      <w:numFmt w:val="bullet"/>
+      <w:lvlText w:val=""/>
+      <w:lvlJc w:val="left"/>
+      <w:pPr>
+        <w:tabs>
+          <w:tab w:val="num" w:pos="1440"/>
+        </w:tabs>
+        <w:ind w:left="1440" w:hanging="360"/>
+      </w:pPr>
+      <w:rPr>
+        <w:rFonts w:ascii="Symbol" w:hAnsi="Symbol" w:hint="default"/>
+        <w:sz w:val="20"/>
+      </w:rPr>
+    </w:lvl>
+    <w:lvl w:ilvl="2" w:tentative="1">
+      <w:start w:val="1"/>
+      <w:numFmt w:val="decimal"/>
+      <w:lvlText w:val="%3."/>
+      <w:lvlJc w:val="left"/>
+      <w:pPr>
+        <w:tabs>
+          <w:tab w:val="num" w:pos="2160"/>
+        </w:tabs>
+        <w:ind w:left="2160" w:hanging="360"/>
+      </w:pPr>
+    </w:lvl>
+    <w:lvl w:ilvl="3" w:tentative="1">
+      <w:start w:val="1"/>
+      <w:numFmt w:val="decimal"/>
+      <w:lvlText w:val="%4."/>
+      <w:lvlJc w:val="left"/>
+      <w:pPr>
+        <w:tabs>
+          <w:tab w:val="num" w:pos="2880"/>
+        </w:tabs>
+        <w:ind w:left="2880" w:hanging="360"/>
+      </w:pPr>
+    </w:lvl>
+    <w:lvl w:ilvl="4" w:tentative="1">
+      <w:start w:val="1"/>
+      <w:numFmt w:val="decimal"/>
+      <w:lvlText w:val="%5."/>
+      <w:lvlJc w:val="left"/>
+      <w:pPr>
+        <w:tabs>
+          <w:tab w:val="num" w:pos="3600"/>
+        </w:tabs>
+        <w:ind w:left="3600" w:hanging="360"/>
+      </w:pPr>
+    </w:lvl>
+    <w:lvl w:ilvl="5" w:tentative="1">
+      <w:start w:val="1"/>
+      <w:numFmt w:val="decimal"/>
+      <w:lvlText w:val="%6."/>
+      <w:lvlJc w:val="left"/>
+      <w:pPr>
+        <w:tabs>
+          <w:tab w:val="num" w:pos="4320"/>
+        </w:tabs>
+        <w:ind w:left="4320" w:hanging="360"/>
+      </w:pPr>
+    </w:lvl>
+    <w:lvl w:ilvl="6" w:tentative="1">
+      <w:start w:val="1"/>
+      <w:numFmt w:val="decimal"/>
+      <w:lvlText w:val="%7."/>
+      <w:lvlJc w:val="left"/>
+      <w:pPr>
+        <w:tabs>
+          <w:tab w:val="num" w:pos="5040"/>
+        </w:tabs>
+        <w:ind w:left="5040" w:hanging="360"/>
+      </w:pPr>
+    </w:lvl>
+    <w:lvl w:ilvl="7" w:tentative="1">
+      <w:start w:val="1"/>
+      <w:numFmt w:val="decimal"/>
+      <w:lvlText w:val="%8."/>
+      <w:lvlJc w:val="left"/>
+      <w:pPr>
+        <w:tabs>
+          <w:tab w:val="num" w:pos="5760"/>
+        </w:tabs>
+        <w:ind w:left="5760" w:hanging="360"/>
+      </w:pPr>
+    </w:lvl>
+    <w:lvl w:ilvl="8" w:tentative="1">
+      <w:start w:val="1"/>
+      <w:numFmt w:val="decimal"/>
+      <w:lvlText w:val="%9."/>
+      <w:lvlJc w:val="left"/>
+      <w:pPr>
+        <w:tabs>
+          <w:tab w:val="num" w:pos="6480"/>
+        </w:tabs>
+        <w:ind w:left="6480" w:hanging="360"/>
+      </w:pPr>
+    </w:lvl>
+  </w:abstractNum>
+  <w:abstractNum w:abstractNumId="15" w15:restartNumberingAfterBreak="0">
     <w:nsid w:val="4FF23E5E"/>
     <w:multiLevelType w:val="multilevel"/>
     <w:tmpl w:val="D67C0FFC"/>
@@ -4279,7 +5536,7 @@
       </w:rPr>
     </w:lvl>
   </w:abstractNum>
-  <w:abstractNum w:abstractNumId="11" w15:restartNumberingAfterBreak="0">
+  <w:abstractNum w:abstractNumId="16" w15:restartNumberingAfterBreak="0">
     <w:nsid w:val="5FC4354F"/>
     <w:multiLevelType w:val="multilevel"/>
     <w:tmpl w:val="8A902F42"/>
@@ -4428,7 +5685,120 @@
       </w:rPr>
     </w:lvl>
   </w:abstractNum>
-  <w:abstractNum w:abstractNumId="12" w15:restartNumberingAfterBreak="0">
+  <w:abstractNum w:abstractNumId="17" w15:restartNumberingAfterBreak="0">
+    <w:nsid w:val="66546E05"/>
+    <w:multiLevelType w:val="multilevel"/>
+    <w:tmpl w:val="10C4881E"/>
+    <w:lvl w:ilvl="0">
+      <w:start w:val="1"/>
+      <w:numFmt w:val="decimal"/>
+      <w:lvlText w:val="%1."/>
+      <w:lvlJc w:val="left"/>
+      <w:pPr>
+        <w:tabs>
+          <w:tab w:val="num" w:pos="720"/>
+        </w:tabs>
+        <w:ind w:left="720" w:hanging="360"/>
+      </w:pPr>
+    </w:lvl>
+    <w:lvl w:ilvl="1" w:tentative="1">
+      <w:start w:val="1"/>
+      <w:numFmt w:val="decimal"/>
+      <w:lvlText w:val="%2."/>
+      <w:lvlJc w:val="left"/>
+      <w:pPr>
+        <w:tabs>
+          <w:tab w:val="num" w:pos="1440"/>
+        </w:tabs>
+        <w:ind w:left="1440" w:hanging="360"/>
+      </w:pPr>
+    </w:lvl>
+    <w:lvl w:ilvl="2" w:tentative="1">
+      <w:start w:val="1"/>
+      <w:numFmt w:val="decimal"/>
+      <w:lvlText w:val="%3."/>
+      <w:lvlJc w:val="left"/>
+      <w:pPr>
+        <w:tabs>
+          <w:tab w:val="num" w:pos="2160"/>
+        </w:tabs>
+        <w:ind w:left="2160" w:hanging="360"/>
+      </w:pPr>
+    </w:lvl>
+    <w:lvl w:ilvl="3" w:tentative="1">
+      <w:start w:val="1"/>
+      <w:numFmt w:val="decimal"/>
+      <w:lvlText w:val="%4."/>
+      <w:lvlJc w:val="left"/>
+      <w:pPr>
+        <w:tabs>
+          <w:tab w:val="num" w:pos="2880"/>
+        </w:tabs>
+        <w:ind w:left="2880" w:hanging="360"/>
+      </w:pPr>
+    </w:lvl>
+    <w:lvl w:ilvl="4" w:tentative="1">
+      <w:start w:val="1"/>
+      <w:numFmt w:val="decimal"/>
+      <w:lvlText w:val="%5."/>
+      <w:lvlJc w:val="left"/>
+      <w:pPr>
+        <w:tabs>
+          <w:tab w:val="num" w:pos="3600"/>
+        </w:tabs>
+        <w:ind w:left="3600" w:hanging="360"/>
+      </w:pPr>
+    </w:lvl>
+    <w:lvl w:ilvl="5" w:tentative="1">
+      <w:start w:val="1"/>
+      <w:numFmt w:val="decimal"/>
+      <w:lvlText w:val="%6."/>
+      <w:lvlJc w:val="left"/>
+      <w:pPr>
+        <w:tabs>
+          <w:tab w:val="num" w:pos="4320"/>
+        </w:tabs>
+        <w:ind w:left="4320" w:hanging="360"/>
+      </w:pPr>
+    </w:lvl>
+    <w:lvl w:ilvl="6" w:tentative="1">
+      <w:start w:val="1"/>
+      <w:numFmt w:val="decimal"/>
+      <w:lvlText w:val="%7."/>
+      <w:lvlJc w:val="left"/>
+      <w:pPr>
+        <w:tabs>
+          <w:tab w:val="num" w:pos="5040"/>
+        </w:tabs>
+        <w:ind w:left="5040" w:hanging="360"/>
+      </w:pPr>
+    </w:lvl>
+    <w:lvl w:ilvl="7" w:tentative="1">
+      <w:start w:val="1"/>
+      <w:numFmt w:val="decimal"/>
+      <w:lvlText w:val="%8."/>
+      <w:lvlJc w:val="left"/>
+      <w:pPr>
+        <w:tabs>
+          <w:tab w:val="num" w:pos="5760"/>
+        </w:tabs>
+        <w:ind w:left="5760" w:hanging="360"/>
+      </w:pPr>
+    </w:lvl>
+    <w:lvl w:ilvl="8" w:tentative="1">
+      <w:start w:val="1"/>
+      <w:numFmt w:val="decimal"/>
+      <w:lvlText w:val="%9."/>
+      <w:lvlJc w:val="left"/>
+      <w:pPr>
+        <w:tabs>
+          <w:tab w:val="num" w:pos="6480"/>
+        </w:tabs>
+        <w:ind w:left="6480" w:hanging="360"/>
+      </w:pPr>
+    </w:lvl>
+  </w:abstractNum>
+  <w:abstractNum w:abstractNumId="18" w15:restartNumberingAfterBreak="0">
     <w:nsid w:val="6B381008"/>
     <w:multiLevelType w:val="multilevel"/>
     <w:tmpl w:val="74462DAA"/>
@@ -4545,7 +5915,120 @@
       </w:pPr>
     </w:lvl>
   </w:abstractNum>
-  <w:abstractNum w:abstractNumId="13" w15:restartNumberingAfterBreak="0">
+  <w:abstractNum w:abstractNumId="19" w15:restartNumberingAfterBreak="0">
+    <w:nsid w:val="71633D69"/>
+    <w:multiLevelType w:val="multilevel"/>
+    <w:tmpl w:val="2CBA6338"/>
+    <w:lvl w:ilvl="0">
+      <w:start w:val="2"/>
+      <w:numFmt w:val="decimal"/>
+      <w:lvlText w:val="%1."/>
+      <w:lvlJc w:val="left"/>
+      <w:pPr>
+        <w:tabs>
+          <w:tab w:val="num" w:pos="720"/>
+        </w:tabs>
+        <w:ind w:left="720" w:hanging="360"/>
+      </w:pPr>
+    </w:lvl>
+    <w:lvl w:ilvl="1" w:tentative="1">
+      <w:start w:val="1"/>
+      <w:numFmt w:val="decimal"/>
+      <w:lvlText w:val="%2."/>
+      <w:lvlJc w:val="left"/>
+      <w:pPr>
+        <w:tabs>
+          <w:tab w:val="num" w:pos="1440"/>
+        </w:tabs>
+        <w:ind w:left="1440" w:hanging="360"/>
+      </w:pPr>
+    </w:lvl>
+    <w:lvl w:ilvl="2" w:tentative="1">
+      <w:start w:val="1"/>
+      <w:numFmt w:val="decimal"/>
+      <w:lvlText w:val="%3."/>
+      <w:lvlJc w:val="left"/>
+      <w:pPr>
+        <w:tabs>
+          <w:tab w:val="num" w:pos="2160"/>
+        </w:tabs>
+        <w:ind w:left="2160" w:hanging="360"/>
+      </w:pPr>
+    </w:lvl>
+    <w:lvl w:ilvl="3" w:tentative="1">
+      <w:start w:val="1"/>
+      <w:numFmt w:val="decimal"/>
+      <w:lvlText w:val="%4."/>
+      <w:lvlJc w:val="left"/>
+      <w:pPr>
+        <w:tabs>
+          <w:tab w:val="num" w:pos="2880"/>
+        </w:tabs>
+        <w:ind w:left="2880" w:hanging="360"/>
+      </w:pPr>
+    </w:lvl>
+    <w:lvl w:ilvl="4" w:tentative="1">
+      <w:start w:val="1"/>
+      <w:numFmt w:val="decimal"/>
+      <w:lvlText w:val="%5."/>
+      <w:lvlJc w:val="left"/>
+      <w:pPr>
+        <w:tabs>
+          <w:tab w:val="num" w:pos="3600"/>
+        </w:tabs>
+        <w:ind w:left="3600" w:hanging="360"/>
+      </w:pPr>
+    </w:lvl>
+    <w:lvl w:ilvl="5" w:tentative="1">
+      <w:start w:val="1"/>
+      <w:numFmt w:val="decimal"/>
+      <w:lvlText w:val="%6."/>
+      <w:lvlJc w:val="left"/>
+      <w:pPr>
+        <w:tabs>
+          <w:tab w:val="num" w:pos="4320"/>
+        </w:tabs>
+        <w:ind w:left="4320" w:hanging="360"/>
+      </w:pPr>
+    </w:lvl>
+    <w:lvl w:ilvl="6" w:tentative="1">
+      <w:start w:val="1"/>
+      <w:numFmt w:val="decimal"/>
+      <w:lvlText w:val="%7."/>
+      <w:lvlJc w:val="left"/>
+      <w:pPr>
+        <w:tabs>
+          <w:tab w:val="num" w:pos="5040"/>
+        </w:tabs>
+        <w:ind w:left="5040" w:hanging="360"/>
+      </w:pPr>
+    </w:lvl>
+    <w:lvl w:ilvl="7" w:tentative="1">
+      <w:start w:val="1"/>
+      <w:numFmt w:val="decimal"/>
+      <w:lvlText w:val="%8."/>
+      <w:lvlJc w:val="left"/>
+      <w:pPr>
+        <w:tabs>
+          <w:tab w:val="num" w:pos="5760"/>
+        </w:tabs>
+        <w:ind w:left="5760" w:hanging="360"/>
+      </w:pPr>
+    </w:lvl>
+    <w:lvl w:ilvl="8" w:tentative="1">
+      <w:start w:val="1"/>
+      <w:numFmt w:val="decimal"/>
+      <w:lvlText w:val="%9."/>
+      <w:lvlJc w:val="left"/>
+      <w:pPr>
+        <w:tabs>
+          <w:tab w:val="num" w:pos="6480"/>
+        </w:tabs>
+        <w:ind w:left="6480" w:hanging="360"/>
+      </w:pPr>
+    </w:lvl>
+  </w:abstractNum>
+  <w:abstractNum w:abstractNumId="20" w15:restartNumberingAfterBreak="0">
     <w:nsid w:val="757263F9"/>
     <w:multiLevelType w:val="multilevel"/>
     <w:tmpl w:val="2ED40688"/>
@@ -4659,34 +6142,34 @@
     </w:lvl>
   </w:abstractNum>
   <w:num w:numId="1" w16cid:durableId="59400527">
-    <w:abstractNumId w:val="4"/>
+    <w:abstractNumId w:val="5"/>
   </w:num>
   <w:num w:numId="2" w16cid:durableId="1004091046">
-    <w:abstractNumId w:val="10"/>
+    <w:abstractNumId w:val="15"/>
   </w:num>
   <w:num w:numId="3" w16cid:durableId="947353714">
-    <w:abstractNumId w:val="6"/>
+    <w:abstractNumId w:val="7"/>
   </w:num>
   <w:num w:numId="4" w16cid:durableId="1856839735">
-    <w:abstractNumId w:val="13"/>
+    <w:abstractNumId w:val="20"/>
   </w:num>
   <w:num w:numId="5" w16cid:durableId="844249846">
     <w:abstractNumId w:val="1"/>
   </w:num>
   <w:num w:numId="6" w16cid:durableId="803813481">
+    <w:abstractNumId w:val="13"/>
+  </w:num>
+  <w:num w:numId="7" w16cid:durableId="318272583">
     <w:abstractNumId w:val="9"/>
   </w:num>
-  <w:num w:numId="7" w16cid:durableId="318272583">
-    <w:abstractNumId w:val="7"/>
-  </w:num>
   <w:num w:numId="8" w16cid:durableId="2044479514">
-    <w:abstractNumId w:val="3"/>
+    <w:abstractNumId w:val="4"/>
   </w:num>
   <w:num w:numId="9" w16cid:durableId="530917817">
-    <w:abstractNumId w:val="11"/>
+    <w:abstractNumId w:val="16"/>
   </w:num>
   <w:num w:numId="10" w16cid:durableId="743406620">
-    <w:abstractNumId w:val="8"/>
+    <w:abstractNumId w:val="12"/>
   </w:num>
   <w:num w:numId="11" w16cid:durableId="544098658">
     <w:abstractNumId w:val="0"/>
@@ -4695,10 +6178,31 @@
     <w:abstractNumId w:val="2"/>
   </w:num>
   <w:num w:numId="13" w16cid:durableId="618075256">
-    <w:abstractNumId w:val="12"/>
+    <w:abstractNumId w:val="18"/>
   </w:num>
   <w:num w:numId="14" w16cid:durableId="1817801375">
-    <w:abstractNumId w:val="5"/>
+    <w:abstractNumId w:val="6"/>
+  </w:num>
+  <w:num w:numId="15" w16cid:durableId="876822086">
+    <w:abstractNumId w:val="17"/>
+  </w:num>
+  <w:num w:numId="16" w16cid:durableId="1652053143">
+    <w:abstractNumId w:val="10"/>
+  </w:num>
+  <w:num w:numId="17" w16cid:durableId="2027635520">
+    <w:abstractNumId w:val="19"/>
+  </w:num>
+  <w:num w:numId="18" w16cid:durableId="1877699345">
+    <w:abstractNumId w:val="8"/>
+  </w:num>
+  <w:num w:numId="19" w16cid:durableId="421683094">
+    <w:abstractNumId w:val="3"/>
+  </w:num>
+  <w:num w:numId="20" w16cid:durableId="1644575198">
+    <w:abstractNumId w:val="11"/>
+  </w:num>
+  <w:num w:numId="21" w16cid:durableId="1166945267">
+    <w:abstractNumId w:val="14"/>
   </w:num>
 </w:numbering>
 </file>

</xml_diff>